<commit_message>
Added Assumptions and Dependencies
</commit_message>
<xml_diff>
--- a/Templates/SRS_TaskManagerApplication.docx
+++ b/Templates/SRS_TaskManagerApplication.docx
@@ -63,12 +63,71 @@
           <w:szCs w:val="24"/>
         </w:rPr>
         <w:t>Project: Task Manager Application</w:t>
+      </w:r>
+      <w:r>
+        <w:rPr>
+          <w:rFonts w:ascii="Arial" w:eastAsia="Arial" w:hAnsi="Arial" w:cs="Arial"/>
+          <w:b/>
+          <w:sz w:val="24"/>
+          <w:szCs w:val="24"/>
+        </w:rPr>
         <w:br/>
-        <w:t>Version: 1.0</w:t>
+        <w:t>Version: 1.1</w:t>
+      </w:r>
+      <w:r>
+        <w:rPr>
+          <w:rFonts w:ascii="Arial" w:eastAsia="Arial" w:hAnsi="Arial" w:cs="Arial"/>
+          <w:b/>
+          <w:sz w:val="24"/>
+          <w:szCs w:val="24"/>
+        </w:rPr>
         <w:br/>
-        <w:t>Authors: &lt;Team Name / Members&gt;</w:t>
+        <w:t xml:space="preserve">Authors: </w:t>
+      </w:r>
+      <w:r>
+        <w:rPr>
+          <w:rFonts w:ascii="Arial" w:eastAsia="Arial" w:hAnsi="Arial" w:cs="Arial"/>
+          <w:b/>
+          <w:sz w:val="24"/>
+          <w:szCs w:val="24"/>
+        </w:rPr>
+        <w:t>Akash</w:t>
+      </w:r>
+      <w:r>
+        <w:rPr>
+          <w:rFonts w:ascii="Arial" w:eastAsia="Arial" w:hAnsi="Arial" w:cs="Arial"/>
+          <w:b/>
+          <w:sz w:val="24"/>
+          <w:szCs w:val="24"/>
+        </w:rPr>
         <w:br/>
-        <w:t>Date: 05-09-2026</w:t>
+        <w:t>Date: 0</w:t>
+      </w:r>
+      <w:r>
+        <w:rPr>
+          <w:rFonts w:ascii="Arial" w:eastAsia="Arial" w:hAnsi="Arial" w:cs="Arial"/>
+          <w:b/>
+          <w:sz w:val="24"/>
+          <w:szCs w:val="24"/>
+        </w:rPr>
+        <w:t>6</w:t>
+      </w:r>
+      <w:r>
+        <w:rPr>
+          <w:rFonts w:ascii="Arial" w:eastAsia="Arial" w:hAnsi="Arial" w:cs="Arial"/>
+          <w:b/>
+          <w:sz w:val="24"/>
+          <w:szCs w:val="24"/>
+        </w:rPr>
+        <w:t>-09-2026</w:t>
+      </w:r>
+      <w:r>
+        <w:rPr>
+          <w:rFonts w:ascii="Arial" w:eastAsia="Arial" w:hAnsi="Arial" w:cs="Arial"/>
+          <w:b/>
+          <w:sz w:val="24"/>
+          <w:szCs w:val="24"/>
+        </w:rPr>
         <w:br/>
         <w:t>Status: Draft</w:t>
       </w:r>
@@ -313,7 +372,7 @@
                 <w:sz w:val="24"/>
                 <w:szCs w:val="24"/>
               </w:rPr>
-              <w:t>Team</w:t>
+              <w:t>Vismay</w:t>
             </w:r>
           </w:p>
         </w:tc>
@@ -353,7 +412,115 @@
                 <w:szCs w:val="24"/>
               </w:rPr>
             </w:pPr>
-            <w:r/>
+          </w:p>
+        </w:tc>
+      </w:tr>
+      <w:tr>
+        <w:tc>
+          <w:tcPr>
+            <w:tcW w:w="1728" w:type="dxa"/>
+          </w:tcPr>
+          <w:p>
+            <w:pPr>
+              <w:spacing w:after="0" w:line="240" w:lineRule="auto"/>
+              <w:rPr>
+                <w:rFonts w:ascii="Arial" w:eastAsia="Arial" w:hAnsi="Arial" w:cs="Arial"/>
+                <w:sz w:val="24"/>
+                <w:szCs w:val="24"/>
+              </w:rPr>
+            </w:pPr>
+            <w:r>
+              <w:rPr>
+                <w:rFonts w:ascii="Arial" w:eastAsia="Arial" w:hAnsi="Arial" w:cs="Arial"/>
+                <w:sz w:val="24"/>
+                <w:szCs w:val="24"/>
+              </w:rPr>
+              <w:t>1.1</w:t>
+            </w:r>
+          </w:p>
+        </w:tc>
+        <w:tc>
+          <w:tcPr>
+            <w:tcW w:w="1728" w:type="dxa"/>
+          </w:tcPr>
+          <w:p>
+            <w:pPr>
+              <w:spacing w:after="0" w:line="240" w:lineRule="auto"/>
+              <w:rPr>
+                <w:rFonts w:ascii="Arial" w:eastAsia="Arial" w:hAnsi="Arial" w:cs="Arial"/>
+                <w:sz w:val="24"/>
+                <w:szCs w:val="24"/>
+              </w:rPr>
+            </w:pPr>
+            <w:r>
+              <w:rPr>
+                <w:rFonts w:ascii="Arial" w:eastAsia="Arial" w:hAnsi="Arial" w:cs="Arial"/>
+                <w:sz w:val="24"/>
+                <w:szCs w:val="24"/>
+              </w:rPr>
+              <w:t>08-09-2026</w:t>
+            </w:r>
+          </w:p>
+        </w:tc>
+        <w:tc>
+          <w:tcPr>
+            <w:tcW w:w="1728" w:type="dxa"/>
+          </w:tcPr>
+          <w:p>
+            <w:pPr>
+              <w:spacing w:after="0" w:line="240" w:lineRule="auto"/>
+              <w:rPr>
+                <w:rFonts w:ascii="Arial" w:eastAsia="Arial" w:hAnsi="Arial" w:cs="Arial"/>
+                <w:sz w:val="24"/>
+                <w:szCs w:val="24"/>
+              </w:rPr>
+            </w:pPr>
+            <w:r>
+              <w:rPr>
+                <w:rFonts w:ascii="Arial" w:eastAsia="Arial" w:hAnsi="Arial" w:cs="Arial"/>
+                <w:sz w:val="24"/>
+                <w:szCs w:val="24"/>
+              </w:rPr>
+              <w:t>Akash</w:t>
+            </w:r>
+          </w:p>
+        </w:tc>
+        <w:tc>
+          <w:tcPr>
+            <w:tcW w:w="1728" w:type="dxa"/>
+          </w:tcPr>
+          <w:p>
+            <w:pPr>
+              <w:spacing w:after="0" w:line="240" w:lineRule="auto"/>
+              <w:rPr>
+                <w:rFonts w:ascii="Arial" w:eastAsia="Arial" w:hAnsi="Arial" w:cs="Arial"/>
+                <w:sz w:val="24"/>
+                <w:szCs w:val="24"/>
+              </w:rPr>
+            </w:pPr>
+            <w:r>
+              <w:rPr>
+                <w:rFonts w:ascii="Arial" w:eastAsia="Arial" w:hAnsi="Arial" w:cs="Arial"/>
+                <w:sz w:val="24"/>
+                <w:szCs w:val="24"/>
+              </w:rPr>
+              <w:t>Added Assumptions and Dependencies section</w:t>
+            </w:r>
+          </w:p>
+        </w:tc>
+        <w:tc>
+          <w:tcPr>
+            <w:tcW w:w="1728" w:type="dxa"/>
+          </w:tcPr>
+          <w:p>
+            <w:pPr>
+              <w:spacing w:after="0" w:line="240" w:lineRule="auto"/>
+              <w:rPr>
+                <w:rFonts w:ascii="Arial" w:eastAsia="Arial" w:hAnsi="Arial" w:cs="Arial"/>
+                <w:sz w:val="24"/>
+                <w:szCs w:val="24"/>
+              </w:rPr>
+            </w:pPr>
           </w:p>
         </w:tc>
       </w:tr>
@@ -808,7 +975,6 @@
           <w:sz w:val="24"/>
           <w:szCs w:val="24"/>
         </w:rPr>
-        <w:lastRenderedPageBreak/>
         <w:t>1. Introduction</w:t>
       </w:r>
     </w:p>
@@ -896,6 +1062,13 @@
           <w:szCs w:val="24"/>
         </w:rPr>
         <w:t>1.2 Scope</w:t>
+      </w:r>
+      <w:r>
+        <w:rPr>
+          <w:rFonts w:ascii="Arial" w:eastAsia="Arial" w:hAnsi="Arial" w:cs="Arial"/>
+          <w:sz w:val="24"/>
+          <w:szCs w:val="24"/>
+        </w:rPr>
         <w:br/>
         <w:t>Covers user registration and login, creation and tracking of tasks and projects, task assignment to team members, a Kanban-style task board, notifications, search/filter, and a basic reporting dashboard. Excludes hosting/infrastructure management and any third-party service internals.</w:t>
       </w:r>
@@ -935,6 +1108,13 @@
           <w:szCs w:val="24"/>
         </w:rPr>
         <w:t>1.3 Audience</w:t>
+      </w:r>
+      <w:r>
+        <w:rPr>
+          <w:rFonts w:ascii="Arial" w:eastAsia="Arial" w:hAnsi="Arial" w:cs="Arial"/>
+          <w:sz w:val="24"/>
+          <w:szCs w:val="24"/>
+        </w:rPr>
         <w:br/>
         <w:t>Developers, QA Engineers, Project/Team Leads, Team Members, and Course Evaluators.</w:t>
       </w:r>
@@ -967,6 +1147,13 @@
           <w:szCs w:val="24"/>
         </w:rPr>
         <w:t>1.4 Definitions</w:t>
+      </w:r>
+      <w:r>
+        <w:rPr>
+          <w:rFonts w:ascii="Arial" w:eastAsia="Arial" w:hAnsi="Arial" w:cs="Arial"/>
+          <w:sz w:val="24"/>
+          <w:szCs w:val="24"/>
+        </w:rPr>
         <w:br/>
         <w:t>List of acronyms: UI, API, REST, JWT, CRUD, SPA, ORM, RBAC.</w:t>
       </w:r>
@@ -1035,11 +1222,16 @@
           <w:szCs w:val="24"/>
         </w:rPr>
         <w:t>2.1 Product perspective</w:t>
+      </w:r>
+      <w:r>
+        <w:rPr>
+          <w:rFonts w:ascii="Arial" w:eastAsia="Arial" w:hAnsi="Arial" w:cs="Arial"/>
+          <w:sz w:val="24"/>
+          <w:szCs w:val="24"/>
+        </w:rPr>
         <w:br/>
         <w:t>The Task Manager Application is a web-based tool with a React.js front end and a Node.js/Express.js back end exposing a REST API. Data is persisted in a MongoDB database. Users interact with the system through a browser to create, assign, and track tasks.</w:t>
       </w:r>
-      <w:proofErr w:type="spellStart"/>
-      <w:proofErr w:type="spellEnd"/>
     </w:p>
     <w:p>
       <w:pPr>
@@ -1069,20 +1261,76 @@
           <w:szCs w:val="24"/>
         </w:rPr>
         <w:t>2.2 Major product functions (detailed)</w:t>
+      </w:r>
+      <w:r>
+        <w:rPr>
+          <w:rFonts w:ascii="Arial" w:eastAsia="Arial" w:hAnsi="Arial" w:cs="Arial"/>
+          <w:sz w:val="24"/>
+          <w:szCs w:val="24"/>
+        </w:rPr>
         <w:br/>
         <w:t>- User registration and authentication</w:t>
+      </w:r>
+      <w:r>
+        <w:rPr>
+          <w:rFonts w:ascii="Arial" w:eastAsia="Arial" w:hAnsi="Arial" w:cs="Arial"/>
+          <w:sz w:val="24"/>
+          <w:szCs w:val="24"/>
+        </w:rPr>
         <w:br/>
         <w:t>- Task creation, editing, and deletion</w:t>
+      </w:r>
+      <w:r>
+        <w:rPr>
+          <w:rFonts w:ascii="Arial" w:eastAsia="Arial" w:hAnsi="Arial" w:cs="Arial"/>
+          <w:sz w:val="24"/>
+          <w:szCs w:val="24"/>
+        </w:rPr>
         <w:br/>
         <w:t>- Task assignment to team members</w:t>
+      </w:r>
+      <w:r>
+        <w:rPr>
+          <w:rFonts w:ascii="Arial" w:eastAsia="Arial" w:hAnsi="Arial" w:cs="Arial"/>
+          <w:sz w:val="24"/>
+          <w:szCs w:val="24"/>
+        </w:rPr>
         <w:br/>
         <w:t>- Kanban-style board view (To Do / In Progress / Done)</w:t>
+      </w:r>
+      <w:r>
+        <w:rPr>
+          <w:rFonts w:ascii="Arial" w:eastAsia="Arial" w:hAnsi="Arial" w:cs="Arial"/>
+          <w:sz w:val="24"/>
+          <w:szCs w:val="24"/>
+        </w:rPr>
         <w:br/>
         <w:t>- Due dates and priority levels on tasks</w:t>
+      </w:r>
+      <w:r>
+        <w:rPr>
+          <w:rFonts w:ascii="Arial" w:eastAsia="Arial" w:hAnsi="Arial" w:cs="Arial"/>
+          <w:sz w:val="24"/>
+          <w:szCs w:val="24"/>
+        </w:rPr>
         <w:br/>
         <w:t>- Comments on tasks for collaboration</w:t>
+      </w:r>
+      <w:r>
+        <w:rPr>
+          <w:rFonts w:ascii="Arial" w:eastAsia="Arial" w:hAnsi="Arial" w:cs="Arial"/>
+          <w:sz w:val="24"/>
+          <w:szCs w:val="24"/>
+        </w:rPr>
         <w:br/>
         <w:t>- In-app notifications and due-date reminders</w:t>
+      </w:r>
+      <w:r>
+        <w:rPr>
+          <w:rFonts w:ascii="Arial" w:eastAsia="Arial" w:hAnsi="Arial" w:cs="Arial"/>
+          <w:sz w:val="24"/>
+          <w:szCs w:val="24"/>
+        </w:rPr>
         <w:br/>
         <w:t>- Search, filter, and dashboard reporting</w:t>
       </w:r>
@@ -1114,10 +1362,40 @@
           <w:szCs w:val="24"/>
         </w:rPr>
         <w:t>2.3 User roles and characteristics (expanded)</w:t>
+      </w:r>
+      <w:r>
+        <w:rPr>
+          <w:rFonts w:ascii="Arial" w:eastAsia="Arial" w:hAnsi="Arial" w:cs="Arial"/>
+          <w:sz w:val="24"/>
+          <w:szCs w:val="24"/>
+        </w:rPr>
         <w:br/>
         <w:t>- Admin: manages user accounts and has full system access.</w:t>
+      </w:r>
+      <w:r>
+        <w:rPr>
+          <w:rFonts w:ascii="Arial" w:eastAsia="Arial" w:hAnsi="Arial" w:cs="Arial"/>
+          <w:sz w:val="24"/>
+          <w:szCs w:val="24"/>
+        </w:rPr>
         <w:br/>
-        <w:t>- Project/Team Lead: creates projects, adds members, assigns tasks, and views reports.</w:t>
+        <w:t xml:space="preserve">- Project/Team Lead: creates projects, adds members, assigns tasks, </w:t>
+      </w:r>
+      <w:r>
+        <w:rPr>
+          <w:rFonts w:ascii="Arial" w:eastAsia="Arial" w:hAnsi="Arial" w:cs="Arial"/>
+          <w:sz w:val="24"/>
+          <w:szCs w:val="24"/>
+        </w:rPr>
+        <w:lastRenderedPageBreak/>
+        <w:t>and views reports.</w:t>
+      </w:r>
+      <w:r>
+        <w:rPr>
+          <w:rFonts w:ascii="Arial" w:eastAsia="Arial" w:hAnsi="Arial" w:cs="Arial"/>
+          <w:sz w:val="24"/>
+          <w:szCs w:val="24"/>
+        </w:rPr>
         <w:br/>
         <w:t>- Team Member: views assigned tasks, updates task status, and adds comments.</w:t>
       </w:r>
@@ -1139,6 +1417,13 @@
           <w:szCs w:val="24"/>
         </w:rPr>
         <w:t>2.4 Operating environment</w:t>
+      </w:r>
+      <w:r>
+        <w:rPr>
+          <w:rFonts w:ascii="Arial" w:eastAsia="Arial" w:hAnsi="Arial" w:cs="Arial"/>
+          <w:sz w:val="24"/>
+          <w:szCs w:val="24"/>
+        </w:rPr>
         <w:br/>
         <w:t>Modern web browsers (Chrome, Firefox, Edge) on desktop or mobile. Backend runs on Node.js/Express hosted on a cloud server, with a MongoDB database. Requires an active internet connection.</w:t>
       </w:r>
@@ -1170,6 +1455,13 @@
           <w:szCs w:val="24"/>
         </w:rPr>
         <w:t>2.5 Constraints</w:t>
+      </w:r>
+      <w:r>
+        <w:rPr>
+          <w:rFonts w:ascii="Arial" w:eastAsia="Arial" w:hAnsi="Arial" w:cs="Arial"/>
+          <w:sz w:val="24"/>
+          <w:szCs w:val="24"/>
+        </w:rPr>
         <w:br/>
         <w:t>Must be delivered as a web application using React.js (frontend) and Node.js/Express.js (backend REST API). Project scope and requirements are tracked and updated in Jira. Semester project timeline with a 4-member team.</w:t>
       </w:r>
@@ -1240,6 +1532,13 @@
           <w:szCs w:val="24"/>
         </w:rPr>
         <w:t>3.1 User interfaces</w:t>
+      </w:r>
+      <w:r>
+        <w:rPr>
+          <w:rFonts w:ascii="Arial" w:eastAsia="Arial" w:hAnsi="Arial" w:cs="Arial"/>
+          <w:sz w:val="24"/>
+          <w:szCs w:val="24"/>
+        </w:rPr>
         <w:br/>
         <w:t>Primary UI: responsive React.js web interface with a dashboard, Kanban board, and task forms. Accessibility: readable font sizes, keyboard navigation, and sufficient contrast.</w:t>
       </w:r>
@@ -1271,6 +1570,13 @@
           <w:szCs w:val="24"/>
         </w:rPr>
         <w:t>3.2 Hardware interfaces</w:t>
+      </w:r>
+      <w:r>
+        <w:rPr>
+          <w:rFonts w:ascii="Arial" w:eastAsia="Arial" w:hAnsi="Arial" w:cs="Arial"/>
+          <w:sz w:val="24"/>
+          <w:szCs w:val="24"/>
+        </w:rPr>
         <w:br/>
         <w:t>None specific. Any standard desktop, laptop, or mobile device with a web browser and internet access.</w:t>
       </w:r>
@@ -1292,12 +1598,40 @@
           <w:szCs w:val="24"/>
         </w:rPr>
         <w:t>3.3 Software interfaces</w:t>
+      </w:r>
+      <w:r>
+        <w:rPr>
+          <w:rFonts w:ascii="Arial" w:eastAsia="Arial" w:hAnsi="Arial" w:cs="Arial"/>
+          <w:sz w:val="24"/>
+          <w:szCs w:val="24"/>
+        </w:rPr>
         <w:br/>
         <w:t>- REST API (Node.js/Express) for all client-server communication (JSON over HTTPS).</w:t>
+      </w:r>
+      <w:r>
+        <w:rPr>
+          <w:rFonts w:ascii="Arial" w:eastAsia="Arial" w:hAnsi="Arial" w:cs="Arial"/>
+          <w:sz w:val="24"/>
+          <w:szCs w:val="24"/>
+        </w:rPr>
         <w:br/>
         <w:t>- MongoDB (via Mongoose) for persistent data storage.</w:t>
+      </w:r>
+      <w:r>
+        <w:rPr>
+          <w:rFonts w:ascii="Arial" w:eastAsia="Arial" w:hAnsi="Arial" w:cs="Arial"/>
+          <w:sz w:val="24"/>
+          <w:szCs w:val="24"/>
+        </w:rPr>
         <w:br/>
         <w:t>- JWT for authentication tokens.</w:t>
+      </w:r>
+      <w:r>
+        <w:rPr>
+          <w:rFonts w:ascii="Arial" w:eastAsia="Arial" w:hAnsi="Arial" w:cs="Arial"/>
+          <w:sz w:val="24"/>
+          <w:szCs w:val="24"/>
+        </w:rPr>
         <w:br/>
         <w:t>- Optional email service (e.g. Nodemailer) for due-date reminders.</w:t>
       </w:r>
@@ -1330,8 +1664,22 @@
           <w:szCs w:val="24"/>
         </w:rPr>
         <w:t>3.4 Communications</w:t>
+      </w:r>
+      <w:r>
+        <w:rPr>
+          <w:rFonts w:ascii="Arial" w:eastAsia="Arial" w:hAnsi="Arial" w:cs="Arial"/>
+          <w:sz w:val="24"/>
+          <w:szCs w:val="24"/>
+        </w:rPr>
         <w:br/>
         <w:t>- HTTPS enforced for all client-server traffic.</w:t>
+      </w:r>
+      <w:r>
+        <w:rPr>
+          <w:rFonts w:ascii="Arial" w:eastAsia="Arial" w:hAnsi="Arial" w:cs="Arial"/>
+          <w:sz w:val="24"/>
+          <w:szCs w:val="24"/>
+        </w:rPr>
         <w:br/>
         <w:t>- REST/JSON APIs with a bearer token (JWT) in the Authorization header for protected routes.</w:t>
       </w:r>
@@ -1368,14 +1716,6 @@
           <w:szCs w:val="24"/>
         </w:rPr>
       </w:pPr>
-      <w:r>
-        <w:rPr>
-          <w:rFonts w:ascii="Arial" w:eastAsia="Arial" w:hAnsi="Arial" w:cs="Arial"/>
-          <w:sz w:val="24"/>
-          <w:szCs w:val="24"/>
-          <w:highlight w:val="yellow"/>
-        </w:rPr>
-      </w:r>
     </w:p>
     <w:p>
       <w:pPr>
@@ -2163,13 +2503,6 @@
                 <w:szCs w:val="24"/>
               </w:rPr>
             </w:pPr>
-            <w:r>
-              <w:rPr>
-                <w:rFonts w:ascii="Arial" w:eastAsia="Arial" w:hAnsi="Arial" w:cs="Arial"/>
-                <w:sz w:val="24"/>
-                <w:szCs w:val="24"/>
-              </w:rPr>
-            </w:r>
           </w:p>
         </w:tc>
       </w:tr>
@@ -2278,6 +2611,7 @@
                 <w:sz w:val="24"/>
                 <w:szCs w:val="24"/>
               </w:rPr>
+              <w:lastRenderedPageBreak/>
               <w:t>Req ID</w:t>
             </w:r>
           </w:p>
@@ -2736,13 +3070,6 @@
                 <w:szCs w:val="24"/>
               </w:rPr>
             </w:pPr>
-            <w:r>
-              <w:rPr>
-                <w:rFonts w:ascii="Arial" w:eastAsia="Arial" w:hAnsi="Arial" w:cs="Arial"/>
-                <w:sz w:val="24"/>
-                <w:szCs w:val="24"/>
-              </w:rPr>
-            </w:r>
           </w:p>
         </w:tc>
       </w:tr>
@@ -2920,10 +3247,26 @@
           <w:sz w:val="24"/>
           <w:szCs w:val="24"/>
         </w:rPr>
-        <w:t>Requirements: The system shall let a project/team lead create a project and add members, assign a task to one or more registered users, display tasks on a Kanban-style board grouped by status, and allow tasks to be moved between status columns. IDs: TM-F-020..TM-F-023.</w:t>
+        <w:t>Requirements: The system shall let a project/team lead create a project and add members, assign a task to one or more registered users, display tasks on a Kanban-style board grouped by status, and allow tasks to be moved between status columns. IDs: TM-F-</w:t>
       </w:r>
       <w:proofErr w:type="gramStart"/>
+      <w:r>
+        <w:rPr>
+          <w:rFonts w:ascii="Arial" w:eastAsia="Arial" w:hAnsi="Arial" w:cs="Arial"/>
+          <w:sz w:val="24"/>
+          <w:szCs w:val="24"/>
+        </w:rPr>
+        <w:t>020..</w:t>
+      </w:r>
       <w:proofErr w:type="gramEnd"/>
+      <w:r>
+        <w:rPr>
+          <w:rFonts w:ascii="Arial" w:eastAsia="Arial" w:hAnsi="Arial" w:cs="Arial"/>
+          <w:sz w:val="24"/>
+          <w:szCs w:val="24"/>
+        </w:rPr>
+        <w:t>TM-F-023.</w:t>
+      </w:r>
     </w:p>
     <w:p>
       <w:pPr>
@@ -2941,6 +3284,7 @@
           <w:sz w:val="24"/>
           <w:szCs w:val="24"/>
         </w:rPr>
+        <w:lastRenderedPageBreak/>
         <w:t>4.4 Notifications &amp; Collaboration</w:t>
       </w:r>
     </w:p>
@@ -2960,10 +3304,26 @@
           <w:sz w:val="24"/>
           <w:szCs w:val="24"/>
         </w:rPr>
-        <w:t>Requirements: Notify an assignee in-app when a task is assigned or its due date is approaching, and allow users to add comments on a task. IDs TM-F-030..TM-F-032.</w:t>
+        <w:t>Requirements: Notify an assignee in-app when a task is assigned or its due date is approaching, and allow users to add comments on a task. IDs TM-F-</w:t>
       </w:r>
       <w:proofErr w:type="gramStart"/>
+      <w:r>
+        <w:rPr>
+          <w:rFonts w:ascii="Arial" w:eastAsia="Arial" w:hAnsi="Arial" w:cs="Arial"/>
+          <w:sz w:val="24"/>
+          <w:szCs w:val="24"/>
+        </w:rPr>
+        <w:t>030..</w:t>
+      </w:r>
       <w:proofErr w:type="gramEnd"/>
+      <w:r>
+        <w:rPr>
+          <w:rFonts w:ascii="Arial" w:eastAsia="Arial" w:hAnsi="Arial" w:cs="Arial"/>
+          <w:sz w:val="24"/>
+          <w:szCs w:val="24"/>
+        </w:rPr>
+        <w:t>TM-F-032.</w:t>
+      </w:r>
     </w:p>
     <w:p>
       <w:pPr>
@@ -3010,10 +3370,26 @@
           <w:sz w:val="24"/>
           <w:szCs w:val="24"/>
         </w:rPr>
-        <w:t>Requirements: Allow users to search tasks by keyword, filter tasks by status/priority/assignee, view a dashboard summarising task counts and overdue tasks, and export a project's task list as CSV. IDs TM-F-040..TM-F-042.</w:t>
+        <w:t>Requirements: Allow users to search tasks by keyword, filter tasks by status/priority/assignee, view a dashboard summarising task counts and overdue tasks, and export a project's task list as CSV. IDs TM-F-</w:t>
       </w:r>
       <w:proofErr w:type="gramStart"/>
+      <w:r>
+        <w:rPr>
+          <w:rFonts w:ascii="Arial" w:eastAsia="Arial" w:hAnsi="Arial" w:cs="Arial"/>
+          <w:sz w:val="24"/>
+          <w:szCs w:val="24"/>
+        </w:rPr>
+        <w:t>040..</w:t>
+      </w:r>
       <w:proofErr w:type="gramEnd"/>
+      <w:r>
+        <w:rPr>
+          <w:rFonts w:ascii="Arial" w:eastAsia="Arial" w:hAnsi="Arial" w:cs="Arial"/>
+          <w:sz w:val="24"/>
+          <w:szCs w:val="24"/>
+        </w:rPr>
+        <w:t>TM-F-042.</w:t>
+      </w:r>
     </w:p>
     <w:p>
       <w:pPr>
@@ -3585,6 +3961,7 @@
                 <w:sz w:val="24"/>
                 <w:szCs w:val="24"/>
               </w:rPr>
+              <w:lastRenderedPageBreak/>
               <w:t>TM-NF-004</w:t>
             </w:r>
           </w:p>
@@ -3852,6 +4229,8 @@
     <w:p>
       <w:r>
         <w:t>1. Protect user credentials and personal data from unauthorized access.</w:t>
+      </w:r>
+      <w:r>
         <w:br/>
         <w:t>2. Ensure that only authorized users can view or modify tasks and projects they are a member of (access control).</w:t>
       </w:r>
@@ -4272,7 +4651,16 @@
                 <w:sz w:val="24"/>
                 <w:szCs w:val="24"/>
               </w:rPr>
-              <w:t>The system shall enforce role-based access control so a user can only view or edit tasks/projects they are a member of.</w:t>
+              <w:t xml:space="preserve">The system shall enforce role-based access control </w:t>
+            </w:r>
+            <w:r>
+              <w:rPr>
+                <w:rFonts w:ascii="Arial" w:eastAsia="Arial" w:hAnsi="Arial" w:cs="Arial"/>
+                <w:sz w:val="24"/>
+                <w:szCs w:val="24"/>
+              </w:rPr>
+              <w:lastRenderedPageBreak/>
+              <w:t>so a user can only view or edit tasks/projects they are a member of.</w:t>
             </w:r>
           </w:p>
         </w:tc>
@@ -4295,6 +4683,7 @@
                 <w:sz w:val="24"/>
                 <w:szCs w:val="24"/>
               </w:rPr>
+              <w:lastRenderedPageBreak/>
               <w:t>Security</w:t>
             </w:r>
           </w:p>
@@ -4336,7 +4725,11 @@
               </w:rPr>
             </w:pPr>
             <w:r>
-              <w:t>AC: non-member request returns 403. Test: TC-Sec-03</w:t>
+              <w:t xml:space="preserve">AC: non-member request returns </w:t>
+            </w:r>
+            <w:r>
+              <w:lastRenderedPageBreak/>
+              <w:t>403. Test: TC-Sec-03</w:t>
             </w:r>
           </w:p>
         </w:tc>
@@ -4361,6 +4754,7 @@
                 <w:sz w:val="24"/>
                 <w:szCs w:val="24"/>
               </w:rPr>
+              <w:lastRenderedPageBreak/>
               <w:t>PRJ-SR-004</w:t>
             </w:r>
           </w:p>
@@ -4671,7 +5065,6 @@
           <w:sz w:val="24"/>
           <w:szCs w:val="24"/>
         </w:rPr>
-        <w:lastRenderedPageBreak/>
         <w:t>7. System models and diagrams</w:t>
       </w:r>
     </w:p>
@@ -5032,7 +5425,6 @@
                 <w:szCs w:val="24"/>
               </w:rPr>
             </w:pPr>
-            <w:proofErr w:type="spellStart"/>
             <w:r>
               <w:rPr>
                 <w:rFonts w:ascii="Arial" w:eastAsia="Arial" w:hAnsi="Arial" w:cs="Arial"/>
@@ -5041,7 +5433,6 @@
               </w:rPr>
               <w:t>Auth Module</w:t>
             </w:r>
-            <w:proofErr w:type="spellEnd"/>
           </w:p>
         </w:tc>
         <w:tc>
@@ -5103,7 +5494,6 @@
                 <w:szCs w:val="24"/>
               </w:rPr>
             </w:pPr>
-            <w:r/>
           </w:p>
         </w:tc>
       </w:tr>
@@ -5190,7 +5580,6 @@
                 <w:szCs w:val="24"/>
               </w:rPr>
             </w:pPr>
-            <w:proofErr w:type="spellStart"/>
             <w:r>
               <w:rPr>
                 <w:rFonts w:ascii="Arial" w:eastAsia="Arial" w:hAnsi="Arial" w:cs="Arial"/>
@@ -5199,7 +5588,6 @@
               </w:rPr>
               <w:t>Task Service</w:t>
             </w:r>
-            <w:proofErr w:type="spellEnd"/>
           </w:p>
         </w:tc>
         <w:tc>
@@ -5261,7 +5649,6 @@
                 <w:szCs w:val="24"/>
               </w:rPr>
             </w:pPr>
-            <w:r/>
           </w:p>
         </w:tc>
       </w:tr>
@@ -5348,7 +5735,6 @@
                 <w:szCs w:val="24"/>
               </w:rPr>
             </w:pPr>
-            <w:proofErr w:type="spellStart"/>
             <w:r>
               <w:rPr>
                 <w:rFonts w:ascii="Arial" w:eastAsia="Arial" w:hAnsi="Arial" w:cs="Arial"/>
@@ -5357,9 +5743,6 @@
               </w:rPr>
               <w:t>Client / API Server</w:t>
             </w:r>
-            <w:proofErr w:type="spellEnd"/>
-            <w:proofErr w:type="spellStart"/>
-            <w:proofErr w:type="spellEnd"/>
           </w:p>
         </w:tc>
         <w:tc>
@@ -5421,7 +5804,6 @@
                 <w:szCs w:val="24"/>
               </w:rPr>
             </w:pPr>
-            <w:r/>
           </w:p>
         </w:tc>
       </w:tr>
@@ -5452,6 +5834,44 @@
           <w:szCs w:val="24"/>
         </w:rPr>
         <w:br/>
+      </w:r>
+    </w:p>
+    <w:p>
+      <w:pPr>
+        <w:pStyle w:val="Heading2"/>
+      </w:pPr>
+      <w:r>
+        <w:t>9. Assumptions and Dependencies</w:t>
+      </w:r>
+    </w:p>
+    <w:p>
+      <w:r>
+        <w:t>- The team has consistent access to Node.js, MongoDB, and a code hosting platform (GitHub) throughout development.</w:t>
+      </w:r>
+    </w:p>
+    <w:p>
+      <w:r>
+        <w:t>- All team members are reachable for coordination on shared modules (auth, task service, board UI).</w:t>
+      </w:r>
+    </w:p>
+    <w:p>
+      <w:r>
+        <w:t>- Users are assumed to have a modern browser and a stable internet connection; offline usage is out of scope.</w:t>
+      </w:r>
+    </w:p>
+    <w:p>
+      <w:r>
+        <w:t>- The project database (MongoDB) is assumed to remain schema-flexible during early development, since requirements may evolve.</w:t>
+      </w:r>
+    </w:p>
+    <w:p>
+      <w:r>
+        <w:t>- Task and project data volumes are assumed to be small-to-moderate (course project scale), so no sharding/clustering is required.</w:t>
+      </w:r>
+    </w:p>
+    <w:p>
+      <w:r>
+        <w:t>- Any change to scope or requirements will be tracked and reflected in Jira before implementation.</w:t>
       </w:r>
     </w:p>
     <w:sectPr>

</xml_diff>